<commit_message>
Approve prototype budget and align facial requirements to 80 percent
</commit_message>
<xml_diff>
--- a/docs/Documento de Requisitos 1.docx
+++ b/docs/Documento de Requisitos 1.docx
@@ -2699,7 +2699,7 @@
       </w:r>
       <w:r>
         <w:rPr/>
-        <w:t xml:space="preserve"> o sistema gera o embedding facial e o compara apenas com o vetor cadastrado do dono do cartão, exigindo similaridade mínima de 85%. </w:t>
+        <w:t xml:space="preserve"> o sistema gera o embedding facial e o compara apenas com o vetor cadastrado do dono do cartão, exigindo similaridade mínima de 80%. </w:t>
       </w:r>
     </w:p>
     <w:p>
@@ -3698,7 +3698,7 @@
               <w:rPr>
                 <w:rStyle w:val="Strong"/>
               </w:rPr>
-              <w:t>85%</w:t>
+              <w:t>80%</w:t>
             </w:r>
             <w:r>
               <w:rPr/>
@@ -4132,7 +4132,7 @@
             </w:r>
             <w:r>
               <w:rPr/>
-              <w:t xml:space="preserve"> as condições forem verdadeiras: cartão válido + rosto compatível (≥ 85%) + horário permitido + usuário ativo.</w:t>
+              <w:t xml:space="preserve"> as condições forem verdadeiras: cartão válido + rosto compatível (≥ 80%) + horário permitido + usuário ativo.</w:t>
             </w:r>
           </w:p>
         </w:tc>

</xml_diff>